<commit_message>
Add decision tree examples for ML Expiry Risk Classifier and LP Operational Allocation logic across Word and PDF documents
</commit_message>
<xml_diff>
--- a/PharmaTrace_AI_Architecture_and_Technical_Specification.docx
+++ b/PharmaTrace_AI_Architecture_and_Technical_Specification.docx
@@ -24,7 +24,7 @@
           <w:color w:val="0E7490"/>
           <w:sz w:val="26"/>
         </w:rPr>
-        <w:t>End-to-End Enterprise Architecture, Predictive Machine Learning, Linear Programming Optimization, and Clinical Regulatory Governance Specification</w:t>
+        <w:t>End-to-End Enterprise Architecture, Predictive Machine Learning, Linear Programming Optimization, Decision Tree Logic, and Clinical Regulatory Governance Specification</w:t>
       </w:r>
     </w:p>
     <w:p>
@@ -985,7 +985,7 @@
                 <w:color w:val="1E293B"/>
                 <w:sz w:val="17"/>
               </w:rPr>
-              <w:t>Inter-Warehouse Transfer (🚚) viable. Evaluates national network to find destination warehouses with demand velocity &gt;= 1.3x origin, ensuring stock can clear destination sales runway before expiry.</w:t>
+              <w:t>Inter-Warehouse Transfer viable. Evaluates national network to find destination warehouses with demand velocity &gt;= 1.3x origin, ensuring stock can clear destination sales runway before expiry.</w:t>
             </w:r>
           </w:p>
         </w:tc>
@@ -2686,7 +2686,7 @@
           <w:color w:val="0B2C5E"/>
           <w:sz w:val="36"/>
         </w:rPr>
-        <w:t>5. Predictive Machine Learning &amp; Experiment Tracking</w:t>
+        <w:t>5. Predictive Machine Learning, Experiment Tracking &amp; Decision Tree Architecture</w:t>
       </w:r>
     </w:p>
     <w:p>
@@ -2744,6 +2744,103 @@
           <w:sz w:val="17"/>
         </w:rPr>
         <w:t>Figure 5.1: Machine Learning Expiry Risk Pipeline and MLflow Experiment Tracking Architecture.</w:t>
+      </w:r>
+    </w:p>
+    <w:p>
+      <w:pPr>
+        <w:pStyle w:val="Heading2"/>
+        <w:spacing w:before="280" w:after="120"/>
+      </w:pPr>
+      <w:r>
+        <w:rPr>
+          <w:b/>
+          <w:color w:val="0E7490"/>
+          <w:sz w:val="28"/>
+        </w:rPr>
+        <w:t>Decision Tree Example 1: Machine Learning Classifier Tree Structure</w:t>
+      </w:r>
+    </w:p>
+    <w:p>
+      <w:pPr>
+        <w:spacing w:after="160"/>
+      </w:pPr>
+      <w:r>
+        <w:t>The Random Forest model consists of 120 randomized bagging decision tree estimators. Figure 5.2 demonstrates an extracted, highly interpretable decision tree from the trained forest. It illustrates the exact recursive binary partitioning logic used to split inventory samples into risk classifications based on Gini impurity reduction.</w:t>
+      </w:r>
+    </w:p>
+    <w:p>
+      <w:r>
+        <w:drawing>
+          <wp:inline xmlns:a="http://schemas.openxmlformats.org/drawingml/2006/main" xmlns:pic="http://schemas.openxmlformats.org/drawingml/2006/picture">
+            <wp:extent cx="5943600" cy="3180347"/>
+            <wp:docPr id="4" name="Picture 4"/>
+            <wp:cNvGraphicFramePr>
+              <a:graphicFrameLocks noChangeAspect="1"/>
+            </wp:cNvGraphicFramePr>
+            <a:graphic>
+              <a:graphicData uri="http://schemas.openxmlformats.org/drawingml/2006/picture">
+                <pic:pic>
+                  <pic:nvPicPr>
+                    <pic:cNvPr id="0" name="diag5_ml_decision_tree.png"/>
+                    <pic:cNvPicPr/>
+                  </pic:nvPicPr>
+                  <pic:blipFill>
+                    <a:blip r:embed="rId12"/>
+                    <a:stretch>
+                      <a:fillRect/>
+                    </a:stretch>
+                  </pic:blipFill>
+                  <pic:spPr>
+                    <a:xfrm>
+                      <a:off x="0" y="0"/>
+                      <a:ext cx="5943600" cy="3180347"/>
+                    </a:xfrm>
+                    <a:prstGeom prst="rect"/>
+                  </pic:spPr>
+                </pic:pic>
+              </a:graphicData>
+            </a:graphic>
+          </wp:inline>
+        </w:drawing>
+      </w:r>
+    </w:p>
+    <w:p>
+      <w:pPr>
+        <w:spacing w:before="80" w:after="240"/>
+      </w:pPr>
+      <w:r>
+        <w:rPr>
+          <w:i/>
+          <w:color w:val="64748B"/>
+          <w:sz w:val="17"/>
+        </w:rPr>
+        <w:t>Figure 5.2: Decision Tree Example 1 — Random Forest Split Hierarchy and Branching Probabilities.</w:t>
+      </w:r>
+    </w:p>
+    <w:p>
+      <w:pPr>
+        <w:pStyle w:val="Heading3"/>
+        <w:spacing w:before="280" w:after="120"/>
+      </w:pPr>
+      <w:r>
+        <w:rPr>
+          <w:b/>
+          <w:color w:val="334155"/>
+          <w:sz w:val="23"/>
+        </w:rPr>
+        <w:t>Step-by-Step Traversal of ML Decision Tree Example</w:t>
+      </w:r>
+    </w:p>
+    <w:p>
+      <w:pPr>
+        <w:spacing w:after="160"/>
+      </w:pPr>
+      <w:r>
+        <w:t>• Root Node: Evaluates Days-to-Expiry (days_to_expiry &lt;= 60.5). If True, the batch enters the urgent branch.</w:t>
+        <w:br/>
+        <w:t>• Left Internal Node (High Urgency): Tests inventory coverage (cover_days &gt;= 45.0). If True, stock will outlast clearance runway; routed to LEAF 1 (Tier 1: Priority Pick, 96% confidence). If False, velocity can absorb stock; routed to LEAF 2 (Tier 2: Urgent Dispatch, 84% confidence).</w:t>
+        <w:br/>
+        <w:t>• Right Internal Node (Normal Runway): Tests daily velocity (daily_velocity &lt;= 8.5 units/day). If True (slow moving), stock is flagged as velocity deficit; routed to LEAF 3 (Tier 2: Normal Dispatch, 88% confidence). If False, routed to LEAF 4 (Tier 3: Strategic Reserve / Healthy, 98% confidence).</w:t>
       </w:r>
     </w:p>
     <w:p>
@@ -3157,7 +3254,7 @@
           <w:color w:val="0B2C5E"/>
           <w:sz w:val="36"/>
         </w:rPr>
-        <w:t>6. Linear Programming (LP) Cost Optimizer</w:t>
+        <w:t>6. Linear Programming (LP) Cost Optimizer &amp; Allocation Decision Tree</w:t>
       </w:r>
     </w:p>
     <w:p>
@@ -3173,7 +3270,7 @@
         <w:drawing>
           <wp:inline xmlns:a="http://schemas.openxmlformats.org/drawingml/2006/main" xmlns:pic="http://schemas.openxmlformats.org/drawingml/2006/picture">
             <wp:extent cx="5943600" cy="2569845"/>
-            <wp:docPr id="4" name="Picture 4"/>
+            <wp:docPr id="5" name="Picture 5"/>
             <wp:cNvGraphicFramePr>
               <a:graphicFrameLocks noChangeAspect="1"/>
             </wp:cNvGraphicFramePr>
@@ -3185,7 +3282,7 @@
                     <pic:cNvPicPr/>
                   </pic:nvPicPr>
                   <pic:blipFill>
-                    <a:blip r:embed="rId12"/>
+                    <a:blip r:embed="rId13"/>
                     <a:stretch>
                       <a:fillRect/>
                     </a:stretch>
@@ -3215,6 +3312,103 @@
           <w:sz w:val="17"/>
         </w:rPr>
         <w:t>Figure 6.1: Linear Programming Multi-Channel Asset Allocation and Solvers.</w:t>
+      </w:r>
+    </w:p>
+    <w:p>
+      <w:pPr>
+        <w:pStyle w:val="Heading2"/>
+        <w:spacing w:before="280" w:after="120"/>
+      </w:pPr>
+      <w:r>
+        <w:rPr>
+          <w:b/>
+          <w:color w:val="0E7490"/>
+          <w:sz w:val="28"/>
+        </w:rPr>
+        <w:t>Decision Tree Example 2: Operational Allocation Decision Tree</w:t>
+      </w:r>
+    </w:p>
+    <w:p>
+      <w:pPr>
+        <w:spacing w:after="160"/>
+      </w:pPr>
+      <w:r>
+        <w:t>To provide operational transparency to supply chain planners and warehouse supervisors, the optimization solver's internal branch-and-bound logic is mapped into a clear Operational Decision Tree (Figure 6.2). Planners can trace every SKU-warehouse decision step-by-step.</w:t>
+      </w:r>
+    </w:p>
+    <w:p>
+      <w:r>
+        <w:drawing>
+          <wp:inline xmlns:a="http://schemas.openxmlformats.org/drawingml/2006/main" xmlns:pic="http://schemas.openxmlformats.org/drawingml/2006/picture">
+            <wp:extent cx="5943600" cy="3180347"/>
+            <wp:docPr id="6" name="Picture 6"/>
+            <wp:cNvGraphicFramePr>
+              <a:graphicFrameLocks noChangeAspect="1"/>
+            </wp:cNvGraphicFramePr>
+            <a:graphic>
+              <a:graphicData uri="http://schemas.openxmlformats.org/drawingml/2006/picture">
+                <pic:pic>
+                  <pic:nvPicPr>
+                    <pic:cNvPr id="0" name="diag6_lp_decision_tree.png"/>
+                    <pic:cNvPicPr/>
+                  </pic:nvPicPr>
+                  <pic:blipFill>
+                    <a:blip r:embed="rId14"/>
+                    <a:stretch>
+                      <a:fillRect/>
+                    </a:stretch>
+                  </pic:blipFill>
+                  <pic:spPr>
+                    <a:xfrm>
+                      <a:off x="0" y="0"/>
+                      <a:ext cx="5943600" cy="3180347"/>
+                    </a:xfrm>
+                    <a:prstGeom prst="rect"/>
+                  </pic:spPr>
+                </pic:pic>
+              </a:graphicData>
+            </a:graphic>
+          </wp:inline>
+        </w:drawing>
+      </w:r>
+    </w:p>
+    <w:p>
+      <w:pPr>
+        <w:spacing w:before="80" w:after="240"/>
+      </w:pPr>
+      <w:r>
+        <w:rPr>
+          <w:i/>
+          <w:color w:val="64748B"/>
+          <w:sz w:val="17"/>
+        </w:rPr>
+        <w:t>Figure 6.2: Decision Tree Example 2 — LP Channel Selection and FEFO Routing Decision Tree.</w:t>
+      </w:r>
+    </w:p>
+    <w:p>
+      <w:pPr>
+        <w:pStyle w:val="Heading3"/>
+        <w:spacing w:before="280" w:after="120"/>
+      </w:pPr>
+      <w:r>
+        <w:rPr>
+          <w:b/>
+          <w:color w:val="334155"/>
+          <w:sz w:val="23"/>
+        </w:rPr>
+        <w:t>Step-by-Step Traversal of LP Operational Decision Tree</w:t>
+      </w:r>
+    </w:p>
+    <w:p>
+      <w:pPr>
+        <w:spacing w:after="160"/>
+      </w:pPr>
+      <w:r>
+        <w:t>• Root Check (Regulatory Horizon): Tests if DTE &lt;= 30 days. If True, stock is in statutory quarantine hazard territory.</w:t>
+        <w:br/>
+        <w:t>• Left Sub-Tree (Quarantine Path): Evaluates whether DTE &lt;= 7 days or remaining velocity cannot clear units. If Yes, routed to ACTION 1: Mandatory Certified Destruction (100% loss booked, but prevents FDA Form 483 citations). If No (30–60d window with secondary buyer demand), routed to ACTION 2: Secondary Liquidation (salvaging 40–65% cash value).</w:t>
+        <w:br/>
+        <w:t>• Right Sub-Tree (Commercial Runway Path): Tests if DTE &gt;= 60 days and a partner warehouse has &gt;= 1.3x higher velocity. If Yes and net margin after freight is positive, routed to ACTION 3: Inter-Warehouse Transfer. If No (local velocity is sufficient), routed to ACTION 4: Standard Commercial FEFO Dispatch (100% full margin revenue).</w:t>
       </w:r>
     </w:p>
     <w:p>
@@ -3509,9 +3703,9 @@
               </w:rPr>
               <w:t>1. Forecast tables exported to outputs/ directory</w:t>
               <w:br/>
-              <w:t>2. Certified Destruction Manifest exported as CSV for FDA compliance audit files</w:t>
+              <w:t>2. Certified Destruction Manifest exported as CSV with Batch / Lot # for FDA compliance audit files</w:t>
               <w:br/>
-              <w:t>3. Action Registers downloadable directly from UI</w:t>
+              <w:t>3. Action Registers with Priority Urgency Status downloadable directly from UI</w:t>
               <w:br/>
               <w:t>4. Diagnostic diagrams saved in outputs/doc_diagrams/</w:t>
             </w:r>

</xml_diff>